<commit_message>
docs: add comparison section to winch try2 thermal report and update handoff
</commit_message>
<xml_diff>
--- a/docs/report/03_Winch_Performance_Tests/try2/Winch_Performance_Thermal_Report_Try2.docx
+++ b/docs/report/03_Winch_Performance_Tests/try2/Winch_Performance_Thermal_Report_Try2.docx
@@ -771,7 +771,34 @@
           <w:color w:val="1B365D"/>
           <w:sz w:val="28"/>
         </w:rPr>
-        <w:t>5. Temperature Trend Plot</w:t>
+        <w:t>5. Comparison with Trial 1 (First 5 Cycles)</w:t>
+      </w:r>
+    </w:p>
+    <w:p>
+      <w:pPr>
+        <w:spacing w:after="120" w:line="276" w:lineRule="auto"/>
+      </w:pPr>
+      <w:r>
+        <w:rPr>
+          <w:rFonts w:ascii="Calibri" w:hAnsi="Calibri"/>
+          <w:sz w:val="22"/>
+        </w:rPr>
+        <w:t>A comparison of the first 5 cycles between Trial 1 (stopped after 5 cycles) and Trial 2 shows high thermal consistency. Trial 2 was conducted at a faster pace (10.7 minutes for 5 cycles vs. 12.5 minutes in Trial 1). The temperature rise (Delta T) is nearly identical: Winch A rose by 20.0°C in Try 1 vs. 18.0°C in Try 2; Winch C rose by 18.0°C in Try 1 vs. 20.0°C in Try 2; and Winch D rose by 11.0°C in Try 1 vs. 12.0°C in Try 2. This confirms a stable heat generation rate of 3.5°C to 4.0°C per cycle for the main hoist motors under a 20T load, proving that the thermal profile is highly repeatable.</w:t>
+      </w:r>
+    </w:p>
+    <w:p>
+      <w:pPr>
+        <w:pStyle w:val="Heading1"/>
+        <w:spacing w:before="240" w:after="120"/>
+      </w:pPr>
+      <w:r>
+        <w:rPr>
+          <w:rFonts w:ascii="Calibri" w:hAnsi="Calibri"/>
+          <w:b/>
+          <w:color w:val="1B365D"/>
+          <w:sz w:val="28"/>
+        </w:rPr>
+        <w:t>6. Temperature Trend Plot</w:t>
       </w:r>
     </w:p>
     <w:p>

</xml_diff>